<commit_message>
going through tests, adding validation, general bugfixes and improvements, ready to ship
</commit_message>
<xml_diff>
--- a/NoahSealyResume.docx
+++ b/NoahSealyResume.docx
@@ -13,10 +13,41 @@
           <w:bCs w:val="1"/>
           <w:i w:val="1"/>
           <w:iCs w:val="1"/>
-        </w:rPr>
-      </w:pPr>
-      <w:bookmarkStart w:colFirst="0" w:colLast="0" w:name="_1rhqvwo27mja" w:id="0"/>
+          <w:sz w:val="22"/>
+          <w:szCs w:val="22"/>
+        </w:rPr>
+      </w:pPr>
+      <w:bookmarkStart w:colFirst="0" w:colLast="0" w:name="_on789ol795s8" w:id="0"/>
       <w:bookmarkEnd w:id="0"/>
+      <w:r>
+        <w:rPr>
+          <w:rFonts w:ascii="Roboto" w:cs="Roboto" w:eastAsia="Roboto" w:hAnsi="Roboto"/>
+          <w:b w:val="1"/>
+          <w:bCs w:val="1"/>
+          <w:i w:val="1"/>
+          <w:iCs w:val="1"/>
+          <w:sz w:val="22"/>
+          <w:szCs w:val="22"/>
+          <w:rtl w:val="0"/>
+        </w:rPr>
+        <w:t xml:space="preserve">noah.sealy@dal.ca</w:t>
+      </w:r>
+    </w:p>
+    <w:p>
+      <w:pPr>
+        <w:pStyle w:val="Heading3"/>
+        <w:spacing w:after="0" w:lineRule="auto"/>
+        <w:ind w:left="-566.9291338582677" w:right="-844.7244094488178" w:firstLine="0"/>
+        <w:rPr>
+          <w:rFonts w:ascii="Roboto" w:cs="Roboto" w:eastAsia="Roboto" w:hAnsi="Roboto"/>
+          <w:b w:val="1"/>
+          <w:bCs w:val="1"/>
+          <w:i w:val="1"/>
+          <w:iCs w:val="1"/>
+        </w:rPr>
+      </w:pPr>
+      <w:bookmarkStart w:colFirst="0" w:colLast="0" w:name="_1rhqvwo27mja" w:id="1"/>
+      <w:bookmarkEnd w:id="1"/>
       <w:r>
         <w:rPr>
           <w:rFonts w:ascii="Roboto" w:cs="Roboto" w:eastAsia="Roboto" w:hAnsi="Roboto"/>
@@ -262,8 +293,8 @@
           <w:iCs w:val="1"/>
         </w:rPr>
       </w:pPr>
-      <w:bookmarkStart w:colFirst="0" w:colLast="0" w:name="_naie4ko837f" w:id="1"/>
-      <w:bookmarkEnd w:id="1"/>
+      <w:bookmarkStart w:colFirst="0" w:colLast="0" w:name="_naie4ko837f" w:id="2"/>
+      <w:bookmarkEnd w:id="2"/>
       <w:r>
         <w:rPr>
           <w:rFonts w:ascii="Roboto" w:cs="Roboto" w:eastAsia="Roboto" w:hAnsi="Roboto"/>
@@ -444,8 +475,8 @@
           <w:szCs w:val="22"/>
         </w:rPr>
       </w:pPr>
-      <w:bookmarkStart w:colFirst="0" w:colLast="0" w:name="_b5v03ajfiyht" w:id="2"/>
-      <w:bookmarkEnd w:id="2"/>
+      <w:bookmarkStart w:colFirst="0" w:colLast="0" w:name="_b5v03ajfiyht" w:id="3"/>
+      <w:bookmarkEnd w:id="3"/>
       <w:r>
         <w:rPr>
           <w:rFonts w:ascii="Roboto" w:cs="Roboto" w:eastAsia="Roboto" w:hAnsi="Roboto"/>
@@ -553,8 +584,8 @@
       <w:ind w:left="-566.9291338582677" w:right="-844.7244094488178" w:firstLine="0"/>
       <w:rPr/>
     </w:pPr>
-    <w:bookmarkStart w:colFirst="0" w:colLast="0" w:name="_30udcvn2skul" w:id="3"/>
-    <w:bookmarkEnd w:id="3"/>
+    <w:bookmarkStart w:colFirst="0" w:colLast="0" w:name="_30udcvn2skul" w:id="4"/>
+    <w:bookmarkEnd w:id="4"/>
     <w:r>
       <w:rPr>
         <w:rtl w:val="0"/>
@@ -572,8 +603,8 @@
         <w:szCs w:val="22"/>
       </w:rPr>
     </w:pPr>
-    <w:bookmarkStart w:colFirst="0" w:colLast="0" w:name="_wav5hm2mszo6" w:id="4"/>
-    <w:bookmarkEnd w:id="4"/>
+    <w:bookmarkStart w:colFirst="0" w:colLast="0" w:name="_wav5hm2mszo6" w:id="5"/>
+    <w:bookmarkEnd w:id="5"/>
     <w:r>
       <w:rPr>
         <w:sz w:val="22"/>

</xml_diff>